<commit_message>
fix(document): mettre à jour les fichiers de modèle avec les nouvelles horodatages et corriger les messages d'erreur
</commit_message>
<xml_diff>
--- a/documents_templates/enrollment-students.docx
+++ b/documents_templates/enrollment-students.docx
@@ -220,7 +220,7 @@
           <w:b/>
           <w:lang w:val="en-US"/>
         </w:rPr>
-        <w:t>+++upper(school.name)+++</w:t>
+        <w:t>+++toUpperCase(school.name)+++</w:t>
       </w:r>
     </w:p>
     <w:p>
@@ -309,13 +309,13 @@
           <w:szCs w:val="20"/>
           <w:lang w:val="en-US"/>
         </w:rPr>
-        <w:t>| +++upper(school.studyYear.yearName)+++</w:t>
+        <w:t>| +++toUpperCase(school.studyYear.yearName)+++</w:t>
       </w:r>
     </w:p>
     <w:tbl>
       <w:tblPr>
         <w:tblStyle w:val="Grilledutableau"/>
-        <w:tblW w:w="10463" w:type="dxa"/>
+        <w:tblW w:w="10467" w:type="dxa"/>
         <w:jc w:val="left"/>
         <w:tblInd w:w="0" w:type="dxa"/>
         <w:tblLayout w:type="fixed"/>
@@ -328,12 +328,13 @@
         <w:tblLook w:val="04a0" w:noHBand="0" w:noVBand="1" w:firstColumn="1" w:lastRow="0" w:lastColumn="0" w:firstRow="1"/>
       </w:tblPr>
       <w:tblGrid>
-        <w:gridCol w:w="507"/>
-        <w:gridCol w:w="3917"/>
-        <w:gridCol w:w="845"/>
-        <w:gridCol w:w="1706"/>
-        <w:gridCol w:w="1246"/>
-        <w:gridCol w:w="2241"/>
+        <w:gridCol w:w="417"/>
+        <w:gridCol w:w="3226"/>
+        <w:gridCol w:w="696"/>
+        <w:gridCol w:w="1561"/>
+        <w:gridCol w:w="1467"/>
+        <w:gridCol w:w="1250"/>
+        <w:gridCol w:w="1850"/>
       </w:tblGrid>
       <w:tr>
         <w:trPr>
@@ -341,7 +342,7 @@
         </w:trPr>
         <w:tc>
           <w:tcPr>
-            <w:tcW w:w="507" w:type="dxa"/>
+            <w:tcW w:w="417" w:type="dxa"/>
             <w:tcBorders/>
             <w:vAlign w:val="center"/>
           </w:tcPr>
@@ -354,15 +355,15 @@
               <w:jc w:val="center"/>
               <w:rPr>
                 <w:rFonts w:ascii="Times New Roman" w:hAnsi="Times New Roman" w:cs="Times New Roman"/>
-                <w:sz w:val="20"/>
-                <w:szCs w:val="20"/>
+                <w:sz w:val="18"/>
+                <w:szCs w:val="18"/>
               </w:rPr>
             </w:pPr>
             <w:r>
               <w:rPr>
                 <w:rFonts w:cs="Times New Roman" w:ascii="Times New Roman" w:hAnsi="Times New Roman"/>
-                <w:sz w:val="20"/>
-                <w:szCs w:val="20"/>
+                <w:sz w:val="18"/>
+                <w:szCs w:val="18"/>
               </w:rPr>
               <w:t>N</w:t>
             </w:r>
@@ -370,9 +371,9 @@
               <w:rPr>
                 <w:rFonts w:eastAsia="DejaVu Sans" w:cs="DejaVu Sans" w:ascii="Times New Roman" w:hAnsi="Times New Roman"/>
                 <w:position w:val="0"/>
-                <w:sz w:val="20"/>
-                <w:sz w:val="20"/>
-                <w:szCs w:val="20"/>
+                <w:sz w:val="18"/>
+                <w:sz w:val="18"/>
+                <w:szCs w:val="18"/>
                 <w:vertAlign w:val="baseline"/>
               </w:rPr>
               <w:t>∘</w:t>
@@ -381,7 +382,7 @@
         </w:tc>
         <w:tc>
           <w:tcPr>
-            <w:tcW w:w="3917" w:type="dxa"/>
+            <w:tcW w:w="3226" w:type="dxa"/>
             <w:tcBorders/>
             <w:vAlign w:val="center"/>
           </w:tcPr>
@@ -394,14 +395,16 @@
               <w:jc w:val="left"/>
               <w:rPr>
                 <w:rFonts w:ascii="Times New Roman" w:hAnsi="Times New Roman"/>
+                <w:sz w:val="18"/>
+                <w:szCs w:val="18"/>
               </w:rPr>
             </w:pPr>
             <w:r>
               <w:rPr>
                 <w:rFonts w:eastAsia="Calibri" w:cs="Times New Roman" w:ascii="Times New Roman" w:hAnsi="Times New Roman"/>
                 <w:kern w:val="0"/>
-                <w:sz w:val="20"/>
-                <w:szCs w:val="20"/>
+                <w:sz w:val="18"/>
+                <w:szCs w:val="18"/>
                 <w:lang w:val="fr-FR" w:eastAsia="en-US" w:bidi="ar-SA"/>
               </w:rPr>
               <w:t>NOM, POST NOM ET PRÉNOM</w:t>
@@ -410,7 +413,7 @@
         </w:tc>
         <w:tc>
           <w:tcPr>
-            <w:tcW w:w="845" w:type="dxa"/>
+            <w:tcW w:w="696" w:type="dxa"/>
             <w:tcBorders>
               <w:right w:val="nil"/>
             </w:tcBorders>
@@ -425,14 +428,16 @@
               <w:jc w:val="center"/>
               <w:rPr>
                 <w:rFonts w:ascii="Times New Roman" w:hAnsi="Times New Roman"/>
+                <w:sz w:val="18"/>
+                <w:szCs w:val="18"/>
               </w:rPr>
             </w:pPr>
             <w:r>
               <w:rPr>
                 <w:rFonts w:eastAsia="Calibri" w:cs="Times New Roman" w:ascii="Times New Roman" w:hAnsi="Times New Roman"/>
                 <w:kern w:val="0"/>
-                <w:sz w:val="20"/>
-                <w:szCs w:val="20"/>
+                <w:sz w:val="18"/>
+                <w:szCs w:val="18"/>
                 <w:lang w:val="fr-FR" w:eastAsia="en-US" w:bidi="ar-SA"/>
               </w:rPr>
               <w:t>SEXE</w:t>
@@ -441,7 +446,7 @@
         </w:tc>
         <w:tc>
           <w:tcPr>
-            <w:tcW w:w="1706" w:type="dxa"/>
+            <w:tcW w:w="1561" w:type="dxa"/>
             <w:tcBorders>
               <w:right w:val="nil"/>
             </w:tcBorders>
@@ -456,23 +461,25 @@
               <w:jc w:val="center"/>
               <w:rPr>
                 <w:rFonts w:ascii="Times New Roman" w:hAnsi="Times New Roman"/>
+                <w:sz w:val="18"/>
+                <w:szCs w:val="18"/>
               </w:rPr>
             </w:pPr>
             <w:r>
               <w:rPr>
                 <w:rFonts w:eastAsia="Calibri" w:cs="Times New Roman" w:ascii="Times New Roman" w:hAnsi="Times New Roman"/>
                 <w:kern w:val="0"/>
-                <w:sz w:val="20"/>
-                <w:szCs w:val="20"/>
-                <w:lang w:val="fr-FR" w:eastAsia="en-US" w:bidi="ar-SA"/>
-              </w:rPr>
-              <w:t>Lieu de naissance</w:t>
-            </w:r>
-          </w:p>
-        </w:tc>
-        <w:tc>
-          <w:tcPr>
-            <w:tcW w:w="1246" w:type="dxa"/>
+                <w:sz w:val="18"/>
+                <w:szCs w:val="18"/>
+                <w:lang w:val="fr-FR" w:eastAsia="en-US" w:bidi="ar-SA"/>
+              </w:rPr>
+              <w:t>LIEU DE NAISSANCE</w:t>
+            </w:r>
+          </w:p>
+        </w:tc>
+        <w:tc>
+          <w:tcPr>
+            <w:tcW w:w="1467" w:type="dxa"/>
             <w:tcBorders>
               <w:right w:val="nil"/>
             </w:tcBorders>
@@ -487,23 +494,58 @@
               <w:jc w:val="center"/>
               <w:rPr>
                 <w:rFonts w:ascii="Times New Roman" w:hAnsi="Times New Roman"/>
+                <w:sz w:val="18"/>
+                <w:szCs w:val="18"/>
               </w:rPr>
             </w:pPr>
             <w:r>
               <w:rPr>
                 <w:rFonts w:eastAsia="Calibri" w:cs="Times New Roman" w:ascii="Times New Roman" w:hAnsi="Times New Roman"/>
                 <w:kern w:val="0"/>
-                <w:sz w:val="20"/>
-                <w:szCs w:val="20"/>
-                <w:lang w:val="fr-FR" w:eastAsia="en-US" w:bidi="ar-SA"/>
-              </w:rPr>
-              <w:t>Date de naissance</w:t>
-            </w:r>
-          </w:p>
-        </w:tc>
-        <w:tc>
-          <w:tcPr>
-            <w:tcW w:w="2241" w:type="dxa"/>
+                <w:sz w:val="18"/>
+                <w:szCs w:val="18"/>
+                <w:lang w:val="fr-FR" w:eastAsia="en-US" w:bidi="ar-SA"/>
+              </w:rPr>
+              <w:t>DATE DE NAISSANCE</w:t>
+            </w:r>
+          </w:p>
+        </w:tc>
+        <w:tc>
+          <w:tcPr>
+            <w:tcW w:w="1250" w:type="dxa"/>
+            <w:tcBorders>
+              <w:right w:val="nil"/>
+            </w:tcBorders>
+            <w:vAlign w:val="center"/>
+          </w:tcPr>
+          <w:p>
+            <w:pPr>
+              <w:pStyle w:val="Normal"/>
+              <w:widowControl/>
+              <w:suppressAutoHyphens w:val="true"/>
+              <w:spacing w:lineRule="auto" w:line="240" w:before="0" w:after="0"/>
+              <w:jc w:val="center"/>
+              <w:rPr>
+                <w:rFonts w:ascii="Times New Roman" w:hAnsi="Times New Roman"/>
+                <w:sz w:val="18"/>
+                <w:szCs w:val="18"/>
+              </w:rPr>
+            </w:pPr>
+            <w:r>
+              <w:rPr>
+                <w:rFonts w:eastAsia="Calibri" w:cs="Times New Roman" w:ascii="Times New Roman" w:hAnsi="Times New Roman"/>
+                <w:kern w:val="0"/>
+                <w:sz w:val="18"/>
+                <w:szCs w:val="18"/>
+                <w:lang w:val="fr-FR" w:eastAsia="en-US" w:bidi="ar-SA"/>
+              </w:rPr>
+              <w:t>STATUT</w:t>
+            </w:r>
+          </w:p>
+        </w:tc>
+        <w:tc>
+          <w:tcPr>
+            <w:tcW w:w="1850" w:type="dxa"/>
             <w:tcBorders/>
             <w:vAlign w:val="center"/>
           </w:tcPr>
@@ -516,17 +558,17 @@
               <w:jc w:val="center"/>
               <w:rPr>
                 <w:rFonts w:ascii="Times New Roman" w:hAnsi="Times New Roman"/>
-              </w:rPr>
-            </w:pPr>
-            <w:r>
-              <w:rPr>
-                <w:rFonts w:eastAsia="Calibri" w:cs="Times New Roman" w:ascii="Times New Roman" w:hAnsi="Times New Roman"/>
-                <w:kern w:val="0"/>
-                <w:sz w:val="20"/>
-                <w:szCs w:val="20"/>
-                <w:lang w:val="fr-FR" w:eastAsia="en-US" w:bidi="ar-SA"/>
-              </w:rPr>
-              <w:t>Encientee</w:t>
+                <w:sz w:val="18"/>
+                <w:szCs w:val="18"/>
+              </w:rPr>
+            </w:pPr>
+            <w:r>
+              <w:rPr>
+                <w:rFonts w:ascii="Times New Roman" w:hAnsi="Times New Roman"/>
+                <w:sz w:val="18"/>
+                <w:szCs w:val="18"/>
+              </w:rPr>
+              <w:t>CODE D'INSCRIPTION</w:t>
             </w:r>
           </w:p>
         </w:tc>
@@ -537,7 +579,7 @@
         </w:trPr>
         <w:tc>
           <w:tcPr>
-            <w:tcW w:w="507" w:type="dxa"/>
+            <w:tcW w:w="417" w:type="dxa"/>
             <w:tcBorders/>
             <w:vAlign w:val="center"/>
           </w:tcPr>
@@ -565,7 +607,7 @@
         </w:tc>
         <w:tc>
           <w:tcPr>
-            <w:tcW w:w="3917" w:type="dxa"/>
+            <w:tcW w:w="3226" w:type="dxa"/>
             <w:tcBorders/>
             <w:vAlign w:val="center"/>
           </w:tcPr>
@@ -596,7 +638,7 @@
         </w:tc>
         <w:tc>
           <w:tcPr>
-            <w:tcW w:w="845" w:type="dxa"/>
+            <w:tcW w:w="696" w:type="dxa"/>
             <w:tcBorders>
               <w:right w:val="nil"/>
             </w:tcBorders>
@@ -626,7 +668,7 @@
         </w:tc>
         <w:tc>
           <w:tcPr>
-            <w:tcW w:w="1706" w:type="dxa"/>
+            <w:tcW w:w="1561" w:type="dxa"/>
             <w:tcBorders>
               <w:right w:val="nil"/>
             </w:tcBorders>
@@ -656,7 +698,7 @@
         </w:tc>
         <w:tc>
           <w:tcPr>
-            <w:tcW w:w="1246" w:type="dxa"/>
+            <w:tcW w:w="1467" w:type="dxa"/>
             <w:tcBorders>
               <w:right w:val="nil"/>
             </w:tcBorders>
@@ -686,7 +728,37 @@
         </w:tc>
         <w:tc>
           <w:tcPr>
-            <w:tcW w:w="2241" w:type="dxa"/>
+            <w:tcW w:w="1250" w:type="dxa"/>
+            <w:tcBorders>
+              <w:right w:val="nil"/>
+            </w:tcBorders>
+            <w:vAlign w:val="center"/>
+          </w:tcPr>
+          <w:p>
+            <w:pPr>
+              <w:pStyle w:val="Normal"/>
+              <w:widowControl/>
+              <w:suppressAutoHyphens w:val="true"/>
+              <w:spacing w:lineRule="auto" w:line="240" w:before="0" w:after="0"/>
+              <w:jc w:val="center"/>
+              <w:rPr>
+                <w:rFonts w:ascii="Times New Roman" w:hAnsi="Times New Roman" w:cs="Times New Roman"/>
+                <w:sz w:val="18"/>
+                <w:szCs w:val="18"/>
+              </w:rPr>
+            </w:pPr>
+            <w:r>
+              <w:rPr>
+                <w:rFonts w:cs="Times New Roman" w:ascii="Times New Roman" w:hAnsi="Times New Roman"/>
+                <w:sz w:val="18"/>
+                <w:szCs w:val="18"/>
+              </w:rPr>
+            </w:r>
+          </w:p>
+        </w:tc>
+        <w:tc>
+          <w:tcPr>
+            <w:tcW w:w="1850" w:type="dxa"/>
             <w:tcBorders/>
             <w:vAlign w:val="center"/>
           </w:tcPr>
@@ -719,7 +791,7 @@
         </w:trPr>
         <w:tc>
           <w:tcPr>
-            <w:tcW w:w="507" w:type="dxa"/>
+            <w:tcW w:w="417" w:type="dxa"/>
             <w:tcBorders/>
             <w:vAlign w:val="center"/>
           </w:tcPr>
@@ -732,16 +804,16 @@
               <w:jc w:val="center"/>
               <w:rPr>
                 <w:rFonts w:ascii="Times New Roman" w:hAnsi="Times New Roman"/>
-                <w:sz w:val="18"/>
-                <w:szCs w:val="18"/>
+                <w:sz w:val="20"/>
+                <w:szCs w:val="20"/>
               </w:rPr>
             </w:pPr>
             <w:r>
               <w:rPr>
                 <w:rFonts w:eastAsia="Calibri" w:cs="Times New Roman" w:ascii="Times New Roman" w:hAnsi="Times New Roman"/>
                 <w:kern w:val="0"/>
-                <w:sz w:val="18"/>
-                <w:szCs w:val="18"/>
+                <w:sz w:val="20"/>
+                <w:szCs w:val="20"/>
                 <w:lang w:val="fr-FR" w:eastAsia="en-US" w:bidi="ar-SA"/>
               </w:rPr>
               <w:t>+++ $idx+1 +++</w:t>
@@ -750,7 +822,7 @@
         </w:tc>
         <w:tc>
           <w:tcPr>
-            <w:tcW w:w="3917" w:type="dxa"/>
+            <w:tcW w:w="3226" w:type="dxa"/>
             <w:tcBorders/>
             <w:vAlign w:val="center"/>
           </w:tcPr>
@@ -763,16 +835,16 @@
               <w:jc w:val="left"/>
               <w:rPr>
                 <w:rFonts w:ascii="Times New Roman" w:hAnsi="Times New Roman"/>
-                <w:sz w:val="18"/>
-                <w:szCs w:val="18"/>
+                <w:sz w:val="20"/>
+                <w:szCs w:val="20"/>
               </w:rPr>
             </w:pPr>
             <w:r>
               <w:rPr>
                 <w:rFonts w:eastAsia="Calibri" w:cs="Times New Roman" w:ascii="Times New Roman" w:hAnsi="Times New Roman"/>
                 <w:kern w:val="0"/>
-                <w:sz w:val="18"/>
-                <w:szCs w:val="18"/>
+                <w:sz w:val="20"/>
+                <w:szCs w:val="20"/>
                 <w:lang w:val="fr-FR" w:eastAsia="en-US" w:bidi="ar-SA"/>
               </w:rPr>
               <w:t>+++$enrollment.student.fullName+++</w:t>
@@ -781,7 +853,7 @@
         </w:tc>
         <w:tc>
           <w:tcPr>
-            <w:tcW w:w="845" w:type="dxa"/>
+            <w:tcW w:w="696" w:type="dxa"/>
             <w:tcBorders>
               <w:right w:val="nil"/>
             </w:tcBorders>
@@ -796,16 +868,16 @@
               <w:jc w:val="left"/>
               <w:rPr>
                 <w:rFonts w:ascii="Times New Roman" w:hAnsi="Times New Roman"/>
-                <w:sz w:val="18"/>
-                <w:szCs w:val="18"/>
+                <w:sz w:val="20"/>
+                <w:szCs w:val="20"/>
               </w:rPr>
             </w:pPr>
             <w:r>
               <w:rPr>
                 <w:rFonts w:eastAsia="Calibri" w:cs="Times New Roman" w:ascii="Times New Roman" w:hAnsi="Times New Roman"/>
                 <w:kern w:val="0"/>
-                <w:sz w:val="18"/>
-                <w:szCs w:val="18"/>
+                <w:sz w:val="20"/>
+                <w:szCs w:val="20"/>
                 <w:lang w:val="fr-FR" w:eastAsia="en-US" w:bidi="ar-SA"/>
               </w:rPr>
               <w:t>+++$enrollment.student.</w:t>
@@ -814,8 +886,8 @@
               <w:rPr>
                 <w:rFonts w:eastAsia="Calibri" w:cs="Times New Roman" w:ascii="Times New Roman" w:hAnsi="Times New Roman"/>
                 <w:kern w:val="0"/>
-                <w:sz w:val="18"/>
-                <w:szCs w:val="18"/>
+                <w:sz w:val="20"/>
+                <w:szCs w:val="20"/>
                 <w:lang w:val="fr-FR" w:eastAsia="en-US" w:bidi="ar-SA"/>
               </w:rPr>
               <w:t>gender</w:t>
@@ -824,8 +896,8 @@
               <w:rPr>
                 <w:rFonts w:eastAsia="Calibri" w:cs="Times New Roman" w:ascii="Times New Roman" w:hAnsi="Times New Roman"/>
                 <w:kern w:val="0"/>
-                <w:sz w:val="18"/>
-                <w:szCs w:val="18"/>
+                <w:sz w:val="20"/>
+                <w:szCs w:val="20"/>
                 <w:lang w:val="fr-FR" w:eastAsia="en-US" w:bidi="ar-SA"/>
               </w:rPr>
               <w:t>+++</w:t>
@@ -834,7 +906,7 @@
         </w:tc>
         <w:tc>
           <w:tcPr>
-            <w:tcW w:w="1706" w:type="dxa"/>
+            <w:tcW w:w="1561" w:type="dxa"/>
             <w:tcBorders>
               <w:right w:val="nil"/>
             </w:tcBorders>
@@ -849,16 +921,16 @@
               <w:jc w:val="left"/>
               <w:rPr>
                 <w:rFonts w:ascii="Times New Roman" w:hAnsi="Times New Roman"/>
-                <w:sz w:val="18"/>
-                <w:szCs w:val="18"/>
+                <w:sz w:val="20"/>
+                <w:szCs w:val="20"/>
               </w:rPr>
             </w:pPr>
             <w:r>
               <w:rPr>
                 <w:rFonts w:eastAsia="Calibri" w:ascii="Times New Roman" w:hAnsi="Times New Roman"/>
                 <w:kern w:val="0"/>
-                <w:sz w:val="18"/>
-                <w:szCs w:val="18"/>
+                <w:sz w:val="20"/>
+                <w:szCs w:val="20"/>
                 <w:lang w:val="fr-FR" w:eastAsia="en-US" w:bidi="ar-SA"/>
               </w:rPr>
               <w:t>+++$enrollment.student.</w:t>
@@ -867,8 +939,8 @@
               <w:rPr>
                 <w:rFonts w:eastAsia="Calibri" w:ascii="Times New Roman" w:hAnsi="Times New Roman"/>
                 <w:kern w:val="0"/>
-                <w:sz w:val="18"/>
-                <w:szCs w:val="18"/>
+                <w:sz w:val="20"/>
+                <w:szCs w:val="20"/>
                 <w:lang w:val="fr-FR" w:eastAsia="en-US" w:bidi="ar-SA"/>
               </w:rPr>
               <w:t>birthPlace</w:t>
@@ -877,8 +949,8 @@
               <w:rPr>
                 <w:rFonts w:eastAsia="Calibri" w:ascii="Times New Roman" w:hAnsi="Times New Roman"/>
                 <w:kern w:val="0"/>
-                <w:sz w:val="18"/>
-                <w:szCs w:val="18"/>
+                <w:sz w:val="20"/>
+                <w:szCs w:val="20"/>
                 <w:lang w:val="fr-FR" w:eastAsia="en-US" w:bidi="ar-SA"/>
               </w:rPr>
               <w:t>+++</w:t>
@@ -887,7 +959,7 @@
         </w:tc>
         <w:tc>
           <w:tcPr>
-            <w:tcW w:w="1246" w:type="dxa"/>
+            <w:tcW w:w="1467" w:type="dxa"/>
             <w:tcBorders>
               <w:right w:val="nil"/>
             </w:tcBorders>
@@ -902,26 +974,46 @@
               <w:jc w:val="left"/>
               <w:rPr>
                 <w:rFonts w:ascii="Times New Roman" w:hAnsi="Times New Roman"/>
-                <w:sz w:val="18"/>
-                <w:szCs w:val="18"/>
+                <w:sz w:val="20"/>
+                <w:szCs w:val="20"/>
               </w:rPr>
             </w:pPr>
             <w:r>
               <w:rPr>
                 <w:rFonts w:eastAsia="Calibri" w:ascii="Times New Roman" w:hAnsi="Times New Roman"/>
                 <w:kern w:val="0"/>
-                <w:sz w:val="18"/>
-                <w:szCs w:val="18"/>
-                <w:lang w:val="fr-FR" w:eastAsia="en-US" w:bidi="ar-SA"/>
-              </w:rPr>
-              <w:t>+++$enrollment.student.</w:t>
+                <w:sz w:val="20"/>
+                <w:szCs w:val="20"/>
+                <w:lang w:val="fr-FR" w:eastAsia="en-US" w:bidi="ar-SA"/>
+              </w:rPr>
+              <w:t>+++formatDate</w:t>
             </w:r>
             <w:r>
               <w:rPr>
                 <w:rFonts w:eastAsia="Calibri" w:ascii="Times New Roman" w:hAnsi="Times New Roman"/>
                 <w:kern w:val="0"/>
-                <w:sz w:val="18"/>
-                <w:szCs w:val="18"/>
+                <w:sz w:val="20"/>
+                <w:szCs w:val="20"/>
+                <w:lang w:val="fr-FR" w:eastAsia="en-US" w:bidi="ar-SA"/>
+              </w:rPr>
+              <w:t>(</w:t>
+            </w:r>
+            <w:r>
+              <w:rPr>
+                <w:rFonts w:eastAsia="Calibri" w:ascii="Times New Roman" w:hAnsi="Times New Roman"/>
+                <w:kern w:val="0"/>
+                <w:sz w:val="20"/>
+                <w:szCs w:val="20"/>
+                <w:lang w:val="fr-FR" w:eastAsia="en-US" w:bidi="ar-SA"/>
+              </w:rPr>
+              <w:t>$enrollment.student.</w:t>
+            </w:r>
+            <w:r>
+              <w:rPr>
+                <w:rFonts w:eastAsia="Calibri" w:ascii="Times New Roman" w:hAnsi="Times New Roman"/>
+                <w:kern w:val="0"/>
+                <w:sz w:val="20"/>
+                <w:szCs w:val="20"/>
                 <w:lang w:val="fr-FR" w:eastAsia="en-US" w:bidi="ar-SA"/>
               </w:rPr>
               <w:t>birthDate</w:t>
@@ -930,8 +1022,18 @@
               <w:rPr>
                 <w:rFonts w:eastAsia="Calibri" w:ascii="Times New Roman" w:hAnsi="Times New Roman"/>
                 <w:kern w:val="0"/>
-                <w:sz w:val="18"/>
-                <w:szCs w:val="18"/>
+                <w:sz w:val="20"/>
+                <w:szCs w:val="20"/>
+                <w:lang w:val="fr-FR" w:eastAsia="en-US" w:bidi="ar-SA"/>
+              </w:rPr>
+              <w:t>)</w:t>
+            </w:r>
+            <w:r>
+              <w:rPr>
+                <w:rFonts w:eastAsia="Calibri" w:ascii="Times New Roman" w:hAnsi="Times New Roman"/>
+                <w:kern w:val="0"/>
+                <w:sz w:val="20"/>
+                <w:szCs w:val="20"/>
                 <w:lang w:val="fr-FR" w:eastAsia="en-US" w:bidi="ar-SA"/>
               </w:rPr>
               <w:t>+++</w:t>
@@ -940,7 +1042,80 @@
         </w:tc>
         <w:tc>
           <w:tcPr>
-            <w:tcW w:w="2241" w:type="dxa"/>
+            <w:tcW w:w="1250" w:type="dxa"/>
+            <w:tcBorders>
+              <w:right w:val="nil"/>
+            </w:tcBorders>
+            <w:vAlign w:val="center"/>
+          </w:tcPr>
+          <w:p>
+            <w:pPr>
+              <w:pStyle w:val="Normal"/>
+              <w:widowControl/>
+              <w:suppressAutoHyphens w:val="true"/>
+              <w:spacing w:lineRule="auto" w:line="240" w:before="0" w:after="0"/>
+              <w:jc w:val="left"/>
+              <w:rPr>
+                <w:rFonts w:ascii="Times New Roman" w:hAnsi="Times New Roman"/>
+                <w:sz w:val="20"/>
+                <w:szCs w:val="20"/>
+              </w:rPr>
+            </w:pPr>
+            <w:r>
+              <w:rPr>
+                <w:rFonts w:eastAsia="Calibri" w:ascii="Times New Roman" w:hAnsi="Times New Roman"/>
+                <w:kern w:val="0"/>
+                <w:sz w:val="20"/>
+                <w:szCs w:val="20"/>
+                <w:lang w:val="fr-FR" w:eastAsia="en-US" w:bidi="ar-SA"/>
+              </w:rPr>
+              <w:t>+++conditionalFormat</w:t>
+            </w:r>
+            <w:r>
+              <w:rPr>
+                <w:rFonts w:eastAsia="Calibri" w:ascii="Times New Roman" w:hAnsi="Times New Roman"/>
+                <w:kern w:val="0"/>
+                <w:sz w:val="20"/>
+                <w:szCs w:val="20"/>
+                <w:lang w:val="fr-FR" w:eastAsia="en-US" w:bidi="ar-SA"/>
+              </w:rPr>
+              <w:t>(</w:t>
+            </w:r>
+            <w:r>
+              <w:rPr>
+                <w:rFonts w:eastAsia="Calibri" w:ascii="Times New Roman" w:hAnsi="Times New Roman"/>
+                <w:kern w:val="0"/>
+                <w:sz w:val="20"/>
+                <w:szCs w:val="20"/>
+                <w:lang w:val="fr-FR" w:eastAsia="en-US" w:bidi="ar-SA"/>
+              </w:rPr>
+              <w:t>$enrollment.isNewStudent, "Nouveau", "Ancien"</w:t>
+            </w:r>
+            <w:r>
+              <w:rPr>
+                <w:rFonts w:eastAsia="Calibri" w:ascii="Times New Roman" w:hAnsi="Times New Roman"/>
+                <w:kern w:val="0"/>
+                <w:sz w:val="20"/>
+                <w:szCs w:val="20"/>
+                <w:lang w:val="fr-FR" w:eastAsia="en-US" w:bidi="ar-SA"/>
+              </w:rPr>
+              <w:t>)</w:t>
+            </w:r>
+            <w:r>
+              <w:rPr>
+                <w:rFonts w:eastAsia="Calibri" w:ascii="Times New Roman" w:hAnsi="Times New Roman"/>
+                <w:kern w:val="0"/>
+                <w:sz w:val="20"/>
+                <w:szCs w:val="20"/>
+                <w:lang w:val="fr-FR" w:eastAsia="en-US" w:bidi="ar-SA"/>
+              </w:rPr>
+              <w:t>+++</w:t>
+            </w:r>
+          </w:p>
+        </w:tc>
+        <w:tc>
+          <w:tcPr>
+            <w:tcW w:w="1850" w:type="dxa"/>
             <w:tcBorders/>
             <w:vAlign w:val="center"/>
           </w:tcPr>
@@ -953,19 +1128,19 @@
               <w:jc w:val="left"/>
               <w:rPr>
                 <w:rFonts w:ascii="Times New Roman" w:hAnsi="Times New Roman"/>
-                <w:sz w:val="18"/>
-                <w:szCs w:val="18"/>
+                <w:sz w:val="20"/>
+                <w:szCs w:val="20"/>
               </w:rPr>
             </w:pPr>
             <w:r>
               <w:rPr>
                 <w:rFonts w:eastAsia="Calibri" w:ascii="Times New Roman" w:hAnsi="Times New Roman"/>
                 <w:kern w:val="0"/>
-                <w:sz w:val="18"/>
-                <w:szCs w:val="18"/>
-                <w:lang w:val="fr-FR" w:eastAsia="en-US" w:bidi="ar-SA"/>
-              </w:rPr>
-              <w:t>+++$enrollment.isNewStudent+++</w:t>
+                <w:sz w:val="20"/>
+                <w:szCs w:val="20"/>
+                <w:lang w:val="fr-FR" w:eastAsia="en-US" w:bidi="ar-SA"/>
+              </w:rPr>
+              <w:t>+++$enrollment.studentCode+++</w:t>
             </w:r>
           </w:p>
         </w:tc>
@@ -976,7 +1151,7 @@
         </w:trPr>
         <w:tc>
           <w:tcPr>
-            <w:tcW w:w="507" w:type="dxa"/>
+            <w:tcW w:w="417" w:type="dxa"/>
             <w:tcBorders/>
             <w:vAlign w:val="center"/>
           </w:tcPr>
@@ -1004,7 +1179,7 @@
         </w:tc>
         <w:tc>
           <w:tcPr>
-            <w:tcW w:w="3917" w:type="dxa"/>
+            <w:tcW w:w="3226" w:type="dxa"/>
             <w:tcBorders/>
             <w:vAlign w:val="center"/>
           </w:tcPr>
@@ -1035,7 +1210,7 @@
         </w:tc>
         <w:tc>
           <w:tcPr>
-            <w:tcW w:w="845" w:type="dxa"/>
+            <w:tcW w:w="696" w:type="dxa"/>
             <w:tcBorders>
               <w:right w:val="nil"/>
             </w:tcBorders>
@@ -1065,7 +1240,7 @@
         </w:tc>
         <w:tc>
           <w:tcPr>
-            <w:tcW w:w="1706" w:type="dxa"/>
+            <w:tcW w:w="1561" w:type="dxa"/>
             <w:tcBorders>
               <w:right w:val="nil"/>
             </w:tcBorders>
@@ -1095,7 +1270,7 @@
         </w:tc>
         <w:tc>
           <w:tcPr>
-            <w:tcW w:w="1246" w:type="dxa"/>
+            <w:tcW w:w="1467" w:type="dxa"/>
             <w:tcBorders>
               <w:right w:val="nil"/>
             </w:tcBorders>
@@ -1125,7 +1300,37 @@
         </w:tc>
         <w:tc>
           <w:tcPr>
-            <w:tcW w:w="2241" w:type="dxa"/>
+            <w:tcW w:w="1250" w:type="dxa"/>
+            <w:tcBorders>
+              <w:right w:val="nil"/>
+            </w:tcBorders>
+            <w:vAlign w:val="center"/>
+          </w:tcPr>
+          <w:p>
+            <w:pPr>
+              <w:pStyle w:val="Normal"/>
+              <w:widowControl/>
+              <w:suppressAutoHyphens w:val="true"/>
+              <w:spacing w:lineRule="auto" w:line="240" w:before="0" w:after="0"/>
+              <w:jc w:val="center"/>
+              <w:rPr>
+                <w:rFonts w:ascii="Times New Roman" w:hAnsi="Times New Roman" w:cs="Times New Roman"/>
+                <w:sz w:val="18"/>
+                <w:szCs w:val="18"/>
+              </w:rPr>
+            </w:pPr>
+            <w:r>
+              <w:rPr>
+                <w:rFonts w:cs="Times New Roman" w:ascii="Times New Roman" w:hAnsi="Times New Roman"/>
+                <w:sz w:val="18"/>
+                <w:szCs w:val="18"/>
+              </w:rPr>
+            </w:r>
+          </w:p>
+        </w:tc>
+        <w:tc>
+          <w:tcPr>
+            <w:tcW w:w="1850" w:type="dxa"/>
             <w:tcBorders/>
             <w:vAlign w:val="center"/>
           </w:tcPr>
@@ -2013,6 +2218,29 @@
     <w:pPr/>
     <w:rPr/>
   </w:style>
+  <w:style w:type="paragraph" w:styleId="Contenudetableau">
+    <w:name w:val="Contenu de tableau"/>
+    <w:basedOn w:val="Normal"/>
+    <w:qFormat/>
+    <w:pPr>
+      <w:widowControl w:val="false"/>
+      <w:suppressLineNumbers/>
+    </w:pPr>
+    <w:rPr/>
+  </w:style>
+  <w:style w:type="paragraph" w:styleId="Titredetableau">
+    <w:name w:val="Titre de tableau"/>
+    <w:basedOn w:val="Contenudetableau"/>
+    <w:qFormat/>
+    <w:pPr>
+      <w:suppressLineNumbers/>
+      <w:jc w:val="center"/>
+    </w:pPr>
+    <w:rPr>
+      <w:b/>
+      <w:bCs/>
+    </w:rPr>
+  </w:style>
   <w:style w:type="numbering" w:styleId="Pasdeliste" w:default="1">
     <w:name w:val="Pas de liste"/>
     <w:uiPriority w:val="99"/>

</xml_diff>

<commit_message>
refactor: reorganize seating export extensions and introduce document template utilities
- Renamed and refactored the SeatingPlanBySheetExcelExportExtension to use a new seating.sheet module.
- Removed the outdated seating-plan.ts file and replaced it with a more structured seating.sheet.ts.
- Updated the seating.docx extension to utilize the new document-template package for generating reports.
- Deleted the additional-context.ts and index.ts files from the docx-template package, moving relevant functionality to the new document-template package.
- Introduced a new sheet.ts file in the document-template package to handle Excel sheet generation with improved styling and structure.
- Created type definitions for enrollments and seating reports to enhance type safety and clarity.
</commit_message>
<xml_diff>
--- a/documents_templates/enrollment-students.docx
+++ b/documents_templates/enrollment-students.docx
@@ -88,7 +88,7 @@
         <mc:AlternateContent>
           <mc:Choice Requires="wps">
             <w:drawing>
-              <wp:anchor behindDoc="0" distT="0" distB="0" distL="113030" distR="111760" simplePos="0" locked="0" layoutInCell="0" allowOverlap="1" relativeHeight="3">
+              <wp:anchor behindDoc="0" distT="0" distB="0" distL="112395" distR="110490" simplePos="0" locked="0" layoutInCell="0" allowOverlap="1" relativeHeight="3">
                 <wp:simplePos x="0" y="0"/>
                 <wp:positionH relativeFrom="margin">
                   <wp:posOffset>5918200</wp:posOffset>
@@ -357,13 +357,13 @@
         <w:tblLook w:val="04a0" w:noHBand="0" w:noVBand="1" w:firstColumn="1" w:lastRow="0" w:lastColumn="0" w:firstRow="1"/>
       </w:tblPr>
       <w:tblGrid>
-        <w:gridCol w:w="505"/>
+        <w:gridCol w:w="504"/>
         <w:gridCol w:w="3138"/>
         <w:gridCol w:w="696"/>
-        <w:gridCol w:w="1561"/>
-        <w:gridCol w:w="1467"/>
-        <w:gridCol w:w="1250"/>
-        <w:gridCol w:w="1856"/>
+        <w:gridCol w:w="1562"/>
+        <w:gridCol w:w="1466"/>
+        <w:gridCol w:w="1251"/>
+        <w:gridCol w:w="1855"/>
       </w:tblGrid>
       <w:tr>
         <w:trPr>
@@ -371,7 +371,7 @@
         </w:trPr>
         <w:tc>
           <w:tcPr>
-            <w:tcW w:w="505" w:type="dxa"/>
+            <w:tcW w:w="504" w:type="dxa"/>
             <w:tcBorders/>
             <w:vAlign w:val="center"/>
           </w:tcPr>
@@ -475,7 +475,7 @@
         </w:tc>
         <w:tc>
           <w:tcPr>
-            <w:tcW w:w="1561" w:type="dxa"/>
+            <w:tcW w:w="1562" w:type="dxa"/>
             <w:tcBorders>
               <w:right w:val="nil"/>
             </w:tcBorders>
@@ -508,7 +508,7 @@
         </w:tc>
         <w:tc>
           <w:tcPr>
-            <w:tcW w:w="1467" w:type="dxa"/>
+            <w:tcW w:w="1466" w:type="dxa"/>
             <w:tcBorders>
               <w:right w:val="nil"/>
             </w:tcBorders>
@@ -541,7 +541,7 @@
         </w:tc>
         <w:tc>
           <w:tcPr>
-            <w:tcW w:w="1250" w:type="dxa"/>
+            <w:tcW w:w="1251" w:type="dxa"/>
             <w:tcBorders>
               <w:right w:val="nil"/>
             </w:tcBorders>
@@ -574,7 +574,7 @@
         </w:tc>
         <w:tc>
           <w:tcPr>
-            <w:tcW w:w="1856" w:type="dxa"/>
+            <w:tcW w:w="1855" w:type="dxa"/>
             <w:tcBorders/>
             <w:vAlign w:val="center"/>
           </w:tcPr>
@@ -608,7 +608,7 @@
         </w:trPr>
         <w:tc>
           <w:tcPr>
-            <w:tcW w:w="505" w:type="dxa"/>
+            <w:tcW w:w="504" w:type="dxa"/>
             <w:tcBorders/>
             <w:vAlign w:val="center"/>
           </w:tcPr>
@@ -697,7 +697,7 @@
         </w:tc>
         <w:tc>
           <w:tcPr>
-            <w:tcW w:w="1561" w:type="dxa"/>
+            <w:tcW w:w="1562" w:type="dxa"/>
             <w:tcBorders>
               <w:right w:val="nil"/>
             </w:tcBorders>
@@ -727,7 +727,7 @@
         </w:tc>
         <w:tc>
           <w:tcPr>
-            <w:tcW w:w="1467" w:type="dxa"/>
+            <w:tcW w:w="1466" w:type="dxa"/>
             <w:tcBorders>
               <w:right w:val="nil"/>
             </w:tcBorders>
@@ -757,7 +757,7 @@
         </w:tc>
         <w:tc>
           <w:tcPr>
-            <w:tcW w:w="1250" w:type="dxa"/>
+            <w:tcW w:w="1251" w:type="dxa"/>
             <w:tcBorders>
               <w:right w:val="nil"/>
             </w:tcBorders>
@@ -787,7 +787,7 @@
         </w:tc>
         <w:tc>
           <w:tcPr>
-            <w:tcW w:w="1856" w:type="dxa"/>
+            <w:tcW w:w="1855" w:type="dxa"/>
             <w:tcBorders/>
             <w:vAlign w:val="center"/>
           </w:tcPr>
@@ -816,11 +816,11 @@
       </w:tr>
       <w:tr>
         <w:trPr>
-          <w:trHeight w:val="406" w:hRule="atLeast"/>
+          <w:trHeight w:val="283" w:hRule="atLeast"/>
         </w:trPr>
         <w:tc>
           <w:tcPr>
-            <w:tcW w:w="505" w:type="dxa"/>
+            <w:tcW w:w="504" w:type="dxa"/>
             <w:tcBorders/>
             <w:vAlign w:val="center"/>
           </w:tcPr>
@@ -832,17 +832,16 @@
               <w:spacing w:lineRule="auto" w:line="240" w:before="0" w:after="0"/>
               <w:jc w:val="center"/>
               <w:rPr>
-                <w:rFonts w:ascii="Times New Roman" w:hAnsi="Times New Roman"/>
-                <w:sz w:val="20"/>
-                <w:szCs w:val="20"/>
+                <w:sz w:val="18"/>
+                <w:szCs w:val="18"/>
               </w:rPr>
             </w:pPr>
             <w:r>
               <w:rPr>
                 <w:rFonts w:eastAsia="Calibri" w:cs="Times New Roman" w:ascii="Times New Roman" w:hAnsi="Times New Roman"/>
                 <w:kern w:val="0"/>
-                <w:sz w:val="20"/>
-                <w:szCs w:val="20"/>
+                <w:sz w:val="18"/>
+                <w:szCs w:val="18"/>
                 <w:lang w:val="fr-FR" w:eastAsia="en-US" w:bidi="ar-SA"/>
               </w:rPr>
               <w:t>+++ $idx+1 +++</w:t>
@@ -863,17 +862,16 @@
               <w:spacing w:lineRule="auto" w:line="240" w:before="0" w:after="0"/>
               <w:jc w:val="left"/>
               <w:rPr>
-                <w:rFonts w:ascii="Times New Roman" w:hAnsi="Times New Roman"/>
-                <w:sz w:val="20"/>
-                <w:szCs w:val="20"/>
+                <w:sz w:val="18"/>
+                <w:szCs w:val="18"/>
               </w:rPr>
             </w:pPr>
             <w:r>
               <w:rPr>
                 <w:rFonts w:eastAsia="Calibri" w:cs="Times New Roman" w:ascii="Times New Roman" w:hAnsi="Times New Roman"/>
                 <w:kern w:val="0"/>
-                <w:sz w:val="20"/>
-                <w:szCs w:val="20"/>
+                <w:sz w:val="18"/>
+                <w:szCs w:val="18"/>
                 <w:lang w:val="fr-FR" w:eastAsia="en-US" w:bidi="ar-SA"/>
               </w:rPr>
               <w:t>+++$enrollment.student.fullName+++</w:t>
@@ -896,46 +894,25 @@
               <w:spacing w:lineRule="auto" w:line="240" w:before="0" w:after="0"/>
               <w:jc w:val="center"/>
               <w:rPr>
-                <w:rFonts w:ascii="Times New Roman" w:hAnsi="Times New Roman"/>
-                <w:sz w:val="20"/>
-                <w:szCs w:val="20"/>
+                <w:sz w:val="18"/>
+                <w:szCs w:val="18"/>
               </w:rPr>
             </w:pPr>
             <w:r>
               <w:rPr>
                 <w:rFonts w:eastAsia="Calibri" w:cs="Times New Roman" w:ascii="Times New Roman" w:hAnsi="Times New Roman"/>
                 <w:kern w:val="0"/>
-                <w:sz w:val="20"/>
-                <w:szCs w:val="20"/>
+                <w:sz w:val="18"/>
+                <w:szCs w:val="18"/>
                 <w:lang w:val="fr-FR" w:eastAsia="en-US" w:bidi="ar-SA"/>
               </w:rPr>
-              <w:t>+++$enrollment.student.</w:t>
-            </w:r>
-            <w:r>
-              <w:rPr>
-                <w:rFonts w:eastAsia="Calibri" w:cs="Times New Roman" w:ascii="Times New Roman" w:hAnsi="Times New Roman"/>
-                <w:kern w:val="0"/>
-                <w:sz w:val="20"/>
-                <w:szCs w:val="20"/>
-                <w:lang w:val="fr-FR" w:eastAsia="en-US" w:bidi="ar-SA"/>
-              </w:rPr>
-              <w:t>gender</w:t>
-            </w:r>
-            <w:r>
-              <w:rPr>
-                <w:rFonts w:eastAsia="Calibri" w:cs="Times New Roman" w:ascii="Times New Roman" w:hAnsi="Times New Roman"/>
-                <w:kern w:val="0"/>
-                <w:sz w:val="20"/>
-                <w:szCs w:val="20"/>
-                <w:lang w:val="fr-FR" w:eastAsia="en-US" w:bidi="ar-SA"/>
-              </w:rPr>
-              <w:t>+++</w:t>
-            </w:r>
-          </w:p>
-        </w:tc>
-        <w:tc>
-          <w:tcPr>
-            <w:tcW w:w="1561" w:type="dxa"/>
+              <w:t>+++$enrollment.student.gender+++</w:t>
+            </w:r>
+          </w:p>
+        </w:tc>
+        <w:tc>
+          <w:tcPr>
+            <w:tcW w:w="1562" w:type="dxa"/>
             <w:tcBorders>
               <w:right w:val="nil"/>
             </w:tcBorders>
@@ -949,46 +926,25 @@
               <w:spacing w:lineRule="auto" w:line="240" w:before="0" w:after="0"/>
               <w:jc w:val="center"/>
               <w:rPr>
-                <w:rFonts w:ascii="Times New Roman" w:hAnsi="Times New Roman"/>
-                <w:sz w:val="20"/>
-                <w:szCs w:val="20"/>
+                <w:sz w:val="18"/>
+                <w:szCs w:val="18"/>
               </w:rPr>
             </w:pPr>
             <w:r>
               <w:rPr>
                 <w:rFonts w:eastAsia="Calibri" w:ascii="Times New Roman" w:hAnsi="Times New Roman"/>
                 <w:kern w:val="0"/>
-                <w:sz w:val="20"/>
-                <w:szCs w:val="20"/>
+                <w:sz w:val="18"/>
+                <w:szCs w:val="18"/>
                 <w:lang w:val="fr-FR" w:eastAsia="en-US" w:bidi="ar-SA"/>
               </w:rPr>
-              <w:t>+++$enrollment.student.</w:t>
-            </w:r>
-            <w:r>
-              <w:rPr>
-                <w:rFonts w:eastAsia="Calibri" w:ascii="Times New Roman" w:hAnsi="Times New Roman"/>
-                <w:kern w:val="0"/>
-                <w:sz w:val="20"/>
-                <w:szCs w:val="20"/>
-                <w:lang w:val="fr-FR" w:eastAsia="en-US" w:bidi="ar-SA"/>
-              </w:rPr>
-              <w:t>birthPlace</w:t>
-            </w:r>
-            <w:r>
-              <w:rPr>
-                <w:rFonts w:eastAsia="Calibri" w:ascii="Times New Roman" w:hAnsi="Times New Roman"/>
-                <w:kern w:val="0"/>
-                <w:sz w:val="20"/>
-                <w:szCs w:val="20"/>
-                <w:lang w:val="fr-FR" w:eastAsia="en-US" w:bidi="ar-SA"/>
-              </w:rPr>
-              <w:t>+++</w:t>
-            </w:r>
-          </w:p>
-        </w:tc>
-        <w:tc>
-          <w:tcPr>
-            <w:tcW w:w="1467" w:type="dxa"/>
+              <w:t>+++$enrollment.student.birthPlace+++</w:t>
+            </w:r>
+          </w:p>
+        </w:tc>
+        <w:tc>
+          <w:tcPr>
+            <w:tcW w:w="1466" w:type="dxa"/>
             <w:tcBorders>
               <w:right w:val="nil"/>
             </w:tcBorders>
@@ -1002,76 +958,25 @@
               <w:spacing w:lineRule="auto" w:line="240" w:before="0" w:after="0"/>
               <w:jc w:val="center"/>
               <w:rPr>
-                <w:rFonts w:ascii="Times New Roman" w:hAnsi="Times New Roman"/>
-                <w:sz w:val="20"/>
-                <w:szCs w:val="20"/>
+                <w:sz w:val="18"/>
+                <w:szCs w:val="18"/>
               </w:rPr>
             </w:pPr>
             <w:r>
               <w:rPr>
                 <w:rFonts w:eastAsia="Calibri" w:ascii="Times New Roman" w:hAnsi="Times New Roman"/>
                 <w:kern w:val="0"/>
-                <w:sz w:val="20"/>
-                <w:szCs w:val="20"/>
+                <w:sz w:val="18"/>
+                <w:szCs w:val="18"/>
                 <w:lang w:val="fr-FR" w:eastAsia="en-US" w:bidi="ar-SA"/>
               </w:rPr>
-              <w:t>+++formatDate</w:t>
-            </w:r>
-            <w:r>
-              <w:rPr>
-                <w:rFonts w:eastAsia="Calibri" w:ascii="Times New Roman" w:hAnsi="Times New Roman"/>
-                <w:kern w:val="0"/>
-                <w:sz w:val="20"/>
-                <w:szCs w:val="20"/>
-                <w:lang w:val="fr-FR" w:eastAsia="en-US" w:bidi="ar-SA"/>
-              </w:rPr>
-              <w:t>(</w:t>
-            </w:r>
-            <w:r>
-              <w:rPr>
-                <w:rFonts w:eastAsia="Calibri" w:ascii="Times New Roman" w:hAnsi="Times New Roman"/>
-                <w:kern w:val="0"/>
-                <w:sz w:val="20"/>
-                <w:szCs w:val="20"/>
-                <w:lang w:val="fr-FR" w:eastAsia="en-US" w:bidi="ar-SA"/>
-              </w:rPr>
-              <w:t>$enrollment.student.</w:t>
-            </w:r>
-            <w:r>
-              <w:rPr>
-                <w:rFonts w:eastAsia="Calibri" w:ascii="Times New Roman" w:hAnsi="Times New Roman"/>
-                <w:kern w:val="0"/>
-                <w:sz w:val="20"/>
-                <w:szCs w:val="20"/>
-                <w:lang w:val="fr-FR" w:eastAsia="en-US" w:bidi="ar-SA"/>
-              </w:rPr>
-              <w:t>birthDate</w:t>
-            </w:r>
-            <w:r>
-              <w:rPr>
-                <w:rFonts w:eastAsia="Calibri" w:ascii="Times New Roman" w:hAnsi="Times New Roman"/>
-                <w:kern w:val="0"/>
-                <w:sz w:val="20"/>
-                <w:szCs w:val="20"/>
-                <w:lang w:val="fr-FR" w:eastAsia="en-US" w:bidi="ar-SA"/>
-              </w:rPr>
-              <w:t>)</w:t>
-            </w:r>
-            <w:r>
-              <w:rPr>
-                <w:rFonts w:eastAsia="Calibri" w:ascii="Times New Roman" w:hAnsi="Times New Roman"/>
-                <w:kern w:val="0"/>
-                <w:sz w:val="20"/>
-                <w:szCs w:val="20"/>
-                <w:lang w:val="fr-FR" w:eastAsia="en-US" w:bidi="ar-SA"/>
-              </w:rPr>
-              <w:t>+++</w:t>
-            </w:r>
-          </w:p>
-        </w:tc>
-        <w:tc>
-          <w:tcPr>
-            <w:tcW w:w="1250" w:type="dxa"/>
+              <w:t>+++formatDate($enrollment.student.birthDate)+++</w:t>
+            </w:r>
+          </w:p>
+        </w:tc>
+        <w:tc>
+          <w:tcPr>
+            <w:tcW w:w="1251" w:type="dxa"/>
             <w:tcBorders>
               <w:right w:val="nil"/>
             </w:tcBorders>
@@ -1085,88 +990,46 @@
               <w:spacing w:lineRule="auto" w:line="240" w:before="0" w:after="0"/>
               <w:jc w:val="center"/>
               <w:rPr>
-                <w:rFonts w:ascii="Times New Roman" w:hAnsi="Times New Roman"/>
-                <w:sz w:val="20"/>
-                <w:szCs w:val="20"/>
+                <w:sz w:val="18"/>
+                <w:szCs w:val="18"/>
               </w:rPr>
             </w:pPr>
             <w:r>
               <w:rPr>
                 <w:rFonts w:eastAsia="Calibri" w:ascii="Times New Roman" w:hAnsi="Times New Roman"/>
                 <w:kern w:val="0"/>
-                <w:sz w:val="20"/>
-                <w:szCs w:val="20"/>
+                <w:sz w:val="18"/>
+                <w:szCs w:val="18"/>
                 <w:lang w:val="fr-FR" w:eastAsia="en-US" w:bidi="ar-SA"/>
               </w:rPr>
-              <w:t>+++conditionalFormat</w:t>
-            </w:r>
+              <w:t>+++conditionalFormat($enrollment.isNewStudent, "Nouveau", "Ancien")+++</w:t>
+            </w:r>
+          </w:p>
+        </w:tc>
+        <w:tc>
+          <w:tcPr>
+            <w:tcW w:w="1855" w:type="dxa"/>
+            <w:tcBorders/>
+            <w:vAlign w:val="center"/>
+          </w:tcPr>
+          <w:p>
+            <w:pPr>
+              <w:pStyle w:val="Normal"/>
+              <w:widowControl/>
+              <w:suppressAutoHyphens w:val="true"/>
+              <w:spacing w:lineRule="auto" w:line="240" w:before="0" w:after="0"/>
+              <w:jc w:val="center"/>
+              <w:rPr>
+                <w:sz w:val="18"/>
+                <w:szCs w:val="18"/>
+              </w:rPr>
+            </w:pPr>
             <w:r>
               <w:rPr>
                 <w:rFonts w:eastAsia="Calibri" w:ascii="Times New Roman" w:hAnsi="Times New Roman"/>
                 <w:kern w:val="0"/>
-                <w:sz w:val="20"/>
-                <w:szCs w:val="20"/>
-                <w:lang w:val="fr-FR" w:eastAsia="en-US" w:bidi="ar-SA"/>
-              </w:rPr>
-              <w:t>(</w:t>
-            </w:r>
-            <w:r>
-              <w:rPr>
-                <w:rFonts w:eastAsia="Calibri" w:ascii="Times New Roman" w:hAnsi="Times New Roman"/>
-                <w:kern w:val="0"/>
-                <w:sz w:val="20"/>
-                <w:szCs w:val="20"/>
-                <w:lang w:val="fr-FR" w:eastAsia="en-US" w:bidi="ar-SA"/>
-              </w:rPr>
-              <w:t>$enrollment.isNewStudent, "Nouveau", "Ancien"</w:t>
-            </w:r>
-            <w:r>
-              <w:rPr>
-                <w:rFonts w:eastAsia="Calibri" w:ascii="Times New Roman" w:hAnsi="Times New Roman"/>
-                <w:kern w:val="0"/>
-                <w:sz w:val="20"/>
-                <w:szCs w:val="20"/>
-                <w:lang w:val="fr-FR" w:eastAsia="en-US" w:bidi="ar-SA"/>
-              </w:rPr>
-              <w:t>)</w:t>
-            </w:r>
-            <w:r>
-              <w:rPr>
-                <w:rFonts w:eastAsia="Calibri" w:ascii="Times New Roman" w:hAnsi="Times New Roman"/>
-                <w:kern w:val="0"/>
-                <w:sz w:val="20"/>
-                <w:szCs w:val="20"/>
-                <w:lang w:val="fr-FR" w:eastAsia="en-US" w:bidi="ar-SA"/>
-              </w:rPr>
-              <w:t>+++</w:t>
-            </w:r>
-          </w:p>
-        </w:tc>
-        <w:tc>
-          <w:tcPr>
-            <w:tcW w:w="1856" w:type="dxa"/>
-            <w:tcBorders/>
-            <w:vAlign w:val="center"/>
-          </w:tcPr>
-          <w:p>
-            <w:pPr>
-              <w:pStyle w:val="Normal"/>
-              <w:widowControl/>
-              <w:suppressAutoHyphens w:val="true"/>
-              <w:spacing w:lineRule="auto" w:line="240" w:before="0" w:after="0"/>
-              <w:jc w:val="center"/>
-              <w:rPr>
-                <w:rFonts w:ascii="Times New Roman" w:hAnsi="Times New Roman"/>
-                <w:sz w:val="20"/>
-                <w:szCs w:val="20"/>
-              </w:rPr>
-            </w:pPr>
-            <w:r>
-              <w:rPr>
-                <w:rFonts w:eastAsia="Calibri" w:ascii="Times New Roman" w:hAnsi="Times New Roman"/>
-                <w:kern w:val="0"/>
-                <w:sz w:val="20"/>
-                <w:szCs w:val="20"/>
+                <w:sz w:val="18"/>
+                <w:szCs w:val="18"/>
                 <w:lang w:val="fr-FR" w:eastAsia="en-US" w:bidi="ar-SA"/>
               </w:rPr>
               <w:t>+++$enrollment.studentCode+++</w:t>
@@ -1180,7 +1043,7 @@
         </w:trPr>
         <w:tc>
           <w:tcPr>
-            <w:tcW w:w="505" w:type="dxa"/>
+            <w:tcW w:w="504" w:type="dxa"/>
             <w:tcBorders/>
             <w:vAlign w:val="center"/>
           </w:tcPr>
@@ -1269,7 +1132,7 @@
         </w:tc>
         <w:tc>
           <w:tcPr>
-            <w:tcW w:w="1561" w:type="dxa"/>
+            <w:tcW w:w="1562" w:type="dxa"/>
             <w:tcBorders>
               <w:right w:val="nil"/>
             </w:tcBorders>
@@ -1299,7 +1162,7 @@
         </w:tc>
         <w:tc>
           <w:tcPr>
-            <w:tcW w:w="1467" w:type="dxa"/>
+            <w:tcW w:w="1466" w:type="dxa"/>
             <w:tcBorders>
               <w:right w:val="nil"/>
             </w:tcBorders>
@@ -1329,7 +1192,7 @@
         </w:tc>
         <w:tc>
           <w:tcPr>
-            <w:tcW w:w="1250" w:type="dxa"/>
+            <w:tcW w:w="1251" w:type="dxa"/>
             <w:tcBorders>
               <w:right w:val="nil"/>
             </w:tcBorders>
@@ -1359,7 +1222,7 @@
         </w:tc>
         <w:tc>
           <w:tcPr>
-            <w:tcW w:w="1856" w:type="dxa"/>
+            <w:tcW w:w="1855" w:type="dxa"/>
             <w:tcBorders/>
             <w:vAlign w:val="center"/>
           </w:tcPr>

</xml_diff>